<commit_message>
release 0.2.2 add wiki and other
</commit_message>
<xml_diff>
--- a/docs/ITSM_Git_Guide.docx
+++ b/docs/ITSM_Git_Guide.docx
@@ -312,6 +312,36 @@
         <w:rPr>
           <w:rStyle w:val="StringTok"/>
         </w:rPr>
+        <w:t xml:space="preserve"># Журнал помилок застосунку (містить адреси сторінок, id користувачів, тексти помилок)</w:t>
+      </w:r>
+      <w:r>
+        <w:br/>
+      </w:r>
+      <w:r>
+        <w:rPr>
+          <w:rStyle w:val="StringTok"/>
+        </w:rPr>
+        <w:t xml:space="preserve">/storage/logs/*</w:t>
+      </w:r>
+      <w:r>
+        <w:br/>
+      </w:r>
+      <w:r>
+        <w:rPr>
+          <w:rStyle w:val="StringTok"/>
+        </w:rPr>
+        <w:t xml:space="preserve">!/storage/logs/.gitkeep</w:t>
+      </w:r>
+      <w:r>
+        <w:br/>
+      </w:r>
+      <w:r>
+        <w:br/>
+      </w:r>
+      <w:r>
+        <w:rPr>
+          <w:rStyle w:val="StringTok"/>
+        </w:rPr>
         <w:t xml:space="preserve"># Системні файли</w:t>
       </w:r>
       <w:r>
@@ -351,7 +381,7 @@
         <w:rPr>
           <w:rStyle w:val="CommentTok"/>
         </w:rPr>
-        <w:t xml:space="preserve"># Порожня папка uploads інакше не потрапить у git взагалі</w:t>
+        <w:t xml:space="preserve"># Порожні папки uploads і logs інакше не потраплять у git взагалі</w:t>
       </w:r>
       <w:r>
         <w:br/>
@@ -366,7 +396,7 @@
         <w:rPr>
           <w:rStyle w:val="NormalTok"/>
         </w:rPr>
-        <w:t xml:space="preserve"> storage/uploads/.gitkeep</w:t>
+        <w:t xml:space="preserve"> storage/uploads/.gitkeep storage/logs/.gitkeep</w:t>
       </w:r>
     </w:p>
     <w:p>

</xml_diff>